<commit_message>
Update Hebrew Formatting for B'reshit 1-31
EHYEH ASHER EHYEH
</commit_message>
<xml_diff>
--- a/01 Tanakh/01 Torah/01 B_reshit/בראשית/בראשית 02.docx
+++ b/01 Tanakh/01 Torah/01 B_reshit/בראשית/בראשית 02.docx
@@ -21,8 +21,9 @@
         <w:rPr>
           <w:b w:val="1"/>
           <w:bCs w:val="1"/>
-          <w:sz w:val="44"/>
-          <w:szCs w:val="44"/>
+          <w:color w:val="121212"/>
+          <w:sz w:val="46"/>
+          <w:szCs w:val="46"/>
         </w:rPr>
       </w:pPr>
       <w:bookmarkStart w:colFirst="0" w:colLast="0" w:name="_lrmbuxk2muww" w:id="0"/>
@@ -59,11 +60,6 @@
           <w:rtl w:val="1"/>
         </w:rPr>
         <w:t xml:space="preserve">ב</w:t>
-      </w:r>
-      <w:r>
-        <w:rPr>
-          <w:rtl w:val="0"/>
-        </w:rPr>
       </w:r>
     </w:p>
     <w:p>
@@ -82,14 +78,8 @@
     </w:p>
     <w:p>
       <w:pPr>
-        <w:shd w:fill="ffffff" w:val="clear"/>
         <w:bidi w:val="1"/>
-        <w:spacing w:line="480" w:lineRule="auto"/>
-        <w:ind w:left="0" w:firstLine="0"/>
-        <w:rPr>
-          <w:b w:val="1"/>
-          <w:bCs w:val="1"/>
-          <w:color w:val="121212"/>
+        <w:rPr>
           <w:sz w:val="28"/>
           <w:szCs w:val="28"/>
         </w:rPr>
@@ -3184,43 +3174,7 @@
           <w:szCs w:val="28"/>
           <w:rtl w:val="1"/>
         </w:rPr>
-        <w:t xml:space="preserve">י</w:t>
-      </w:r>
-      <w:r>
-        <w:rPr>
-          <w:color w:val="121212"/>
-          <w:sz w:val="28"/>
-          <w:szCs w:val="28"/>
-          <w:rtl w:val="1"/>
-        </w:rPr>
-        <w:t xml:space="preserve">ְ</w:t>
-      </w:r>
-      <w:r>
-        <w:rPr>
-          <w:color w:val="121212"/>
-          <w:sz w:val="28"/>
-          <w:szCs w:val="28"/>
-          <w:rtl w:val="1"/>
-        </w:rPr>
-        <w:t xml:space="preserve">הו</w:t>
-      </w:r>
-      <w:r>
-        <w:rPr>
-          <w:color w:val="121212"/>
-          <w:sz w:val="28"/>
-          <w:szCs w:val="28"/>
-          <w:rtl w:val="1"/>
-        </w:rPr>
-        <w:t xml:space="preserve">ָ֥</w:t>
-      </w:r>
-      <w:r>
-        <w:rPr>
-          <w:color w:val="121212"/>
-          <w:sz w:val="28"/>
-          <w:szCs w:val="28"/>
-          <w:rtl w:val="1"/>
-        </w:rPr>
-        <w:t xml:space="preserve">ה</w:t>
+        <w:t xml:space="preserve">יהוה</w:t>
       </w:r>
       <w:r>
         <w:rPr>
@@ -4277,43 +4231,7 @@
           <w:szCs w:val="28"/>
           <w:rtl w:val="1"/>
         </w:rPr>
-        <w:t xml:space="preserve">י</w:t>
-      </w:r>
-      <w:r>
-        <w:rPr>
-          <w:color w:val="121212"/>
-          <w:sz w:val="28"/>
-          <w:szCs w:val="28"/>
-          <w:rtl w:val="1"/>
-        </w:rPr>
-        <w:t xml:space="preserve">ְ</w:t>
-      </w:r>
-      <w:r>
-        <w:rPr>
-          <w:color w:val="121212"/>
-          <w:sz w:val="28"/>
-          <w:szCs w:val="28"/>
-          <w:rtl w:val="1"/>
-        </w:rPr>
-        <w:t xml:space="preserve">הו</w:t>
-      </w:r>
-      <w:r>
-        <w:rPr>
-          <w:color w:val="121212"/>
-          <w:sz w:val="28"/>
-          <w:szCs w:val="28"/>
-          <w:rtl w:val="1"/>
-        </w:rPr>
-        <w:t xml:space="preserve">ָ֤</w:t>
-      </w:r>
-      <w:r>
-        <w:rPr>
-          <w:color w:val="121212"/>
-          <w:sz w:val="28"/>
-          <w:szCs w:val="28"/>
-          <w:rtl w:val="1"/>
-        </w:rPr>
-        <w:t xml:space="preserve">ה</w:t>
+        <w:t xml:space="preserve">יהוה</w:t>
       </w:r>
       <w:r>
         <w:rPr>
@@ -5473,43 +5391,7 @@
           <w:szCs w:val="28"/>
           <w:rtl w:val="1"/>
         </w:rPr>
-        <w:t xml:space="preserve">י</w:t>
-      </w:r>
-      <w:r>
-        <w:rPr>
-          <w:color w:val="121212"/>
-          <w:sz w:val="28"/>
-          <w:szCs w:val="28"/>
-          <w:rtl w:val="1"/>
-        </w:rPr>
-        <w:t xml:space="preserve">ְ</w:t>
-      </w:r>
-      <w:r>
-        <w:rPr>
-          <w:color w:val="121212"/>
-          <w:sz w:val="28"/>
-          <w:szCs w:val="28"/>
-          <w:rtl w:val="1"/>
-        </w:rPr>
-        <w:t xml:space="preserve">הו</w:t>
-      </w:r>
-      <w:r>
-        <w:rPr>
-          <w:color w:val="121212"/>
-          <w:sz w:val="28"/>
-          <w:szCs w:val="28"/>
-          <w:rtl w:val="1"/>
-        </w:rPr>
-        <w:t xml:space="preserve">ָ֨</w:t>
-      </w:r>
-      <w:r>
-        <w:rPr>
-          <w:color w:val="121212"/>
-          <w:sz w:val="28"/>
-          <w:szCs w:val="28"/>
-          <w:rtl w:val="1"/>
-        </w:rPr>
-        <w:t xml:space="preserve">ה</w:t>
+        <w:t xml:space="preserve">יהוה</w:t>
       </w:r>
       <w:r>
         <w:rPr>
@@ -6585,43 +6467,7 @@
           <w:szCs w:val="28"/>
           <w:rtl w:val="1"/>
         </w:rPr>
-        <w:t xml:space="preserve">י</w:t>
-      </w:r>
-      <w:r>
-        <w:rPr>
-          <w:color w:val="121212"/>
-          <w:sz w:val="28"/>
-          <w:szCs w:val="28"/>
-          <w:rtl w:val="1"/>
-        </w:rPr>
-        <w:t xml:space="preserve">ְ</w:t>
-      </w:r>
-      <w:r>
-        <w:rPr>
-          <w:color w:val="121212"/>
-          <w:sz w:val="28"/>
-          <w:szCs w:val="28"/>
-          <w:rtl w:val="1"/>
-        </w:rPr>
-        <w:t xml:space="preserve">הו</w:t>
-      </w:r>
-      <w:r>
-        <w:rPr>
-          <w:color w:val="121212"/>
-          <w:sz w:val="28"/>
-          <w:szCs w:val="28"/>
-          <w:rtl w:val="1"/>
-        </w:rPr>
-        <w:t xml:space="preserve">ָ֧</w:t>
-      </w:r>
-      <w:r>
-        <w:rPr>
-          <w:color w:val="121212"/>
-          <w:sz w:val="28"/>
-          <w:szCs w:val="28"/>
-          <w:rtl w:val="1"/>
-        </w:rPr>
-        <w:t xml:space="preserve">ה</w:t>
+        <w:t xml:space="preserve">יהוה</w:t>
       </w:r>
       <w:r>
         <w:rPr>
@@ -7442,43 +7288,7 @@
           <w:szCs w:val="28"/>
           <w:rtl w:val="1"/>
         </w:rPr>
-        <w:t xml:space="preserve">י</w:t>
-      </w:r>
-      <w:r>
-        <w:rPr>
-          <w:color w:val="121212"/>
-          <w:sz w:val="28"/>
-          <w:szCs w:val="28"/>
-          <w:rtl w:val="1"/>
-        </w:rPr>
-        <w:t xml:space="preserve">ְ</w:t>
-      </w:r>
-      <w:r>
-        <w:rPr>
-          <w:color w:val="121212"/>
-          <w:sz w:val="28"/>
-          <w:szCs w:val="28"/>
-          <w:rtl w:val="1"/>
-        </w:rPr>
-        <w:t xml:space="preserve">הו</w:t>
-      </w:r>
-      <w:r>
-        <w:rPr>
-          <w:color w:val="121212"/>
-          <w:sz w:val="28"/>
-          <w:szCs w:val="28"/>
-          <w:rtl w:val="1"/>
-        </w:rPr>
-        <w:t xml:space="preserve">ָ֤</w:t>
-      </w:r>
-      <w:r>
-        <w:rPr>
-          <w:color w:val="121212"/>
-          <w:sz w:val="28"/>
-          <w:szCs w:val="28"/>
-          <w:rtl w:val="1"/>
-        </w:rPr>
-        <w:t xml:space="preserve">ה</w:t>
+        <w:t xml:space="preserve">יהוה</w:t>
       </w:r>
       <w:r>
         <w:rPr>
@@ -12146,43 +11956,7 @@
           <w:szCs w:val="28"/>
           <w:rtl w:val="1"/>
         </w:rPr>
-        <w:t xml:space="preserve">י</w:t>
-      </w:r>
-      <w:r>
-        <w:rPr>
-          <w:color w:val="121212"/>
-          <w:sz w:val="28"/>
-          <w:szCs w:val="28"/>
-          <w:rtl w:val="1"/>
-        </w:rPr>
-        <w:t xml:space="preserve">ְ</w:t>
-      </w:r>
-      <w:r>
-        <w:rPr>
-          <w:color w:val="121212"/>
-          <w:sz w:val="28"/>
-          <w:szCs w:val="28"/>
-          <w:rtl w:val="1"/>
-        </w:rPr>
-        <w:t xml:space="preserve">הו</w:t>
-      </w:r>
-      <w:r>
-        <w:rPr>
-          <w:color w:val="121212"/>
-          <w:sz w:val="28"/>
-          <w:szCs w:val="28"/>
-          <w:rtl w:val="1"/>
-        </w:rPr>
-        <w:t xml:space="preserve">ָ֥</w:t>
-      </w:r>
-      <w:r>
-        <w:rPr>
-          <w:color w:val="121212"/>
-          <w:sz w:val="28"/>
-          <w:szCs w:val="28"/>
-          <w:rtl w:val="1"/>
-        </w:rPr>
-        <w:t xml:space="preserve">ה</w:t>
+        <w:t xml:space="preserve">יהוה</w:t>
       </w:r>
       <w:r>
         <w:rPr>
@@ -12861,43 +12635,7 @@
           <w:szCs w:val="28"/>
           <w:rtl w:val="1"/>
         </w:rPr>
-        <w:t xml:space="preserve">י</w:t>
-      </w:r>
-      <w:r>
-        <w:rPr>
-          <w:color w:val="121212"/>
-          <w:sz w:val="28"/>
-          <w:szCs w:val="28"/>
-          <w:rtl w:val="1"/>
-        </w:rPr>
-        <w:t xml:space="preserve">ְ</w:t>
-      </w:r>
-      <w:r>
-        <w:rPr>
-          <w:color w:val="121212"/>
-          <w:sz w:val="28"/>
-          <w:szCs w:val="28"/>
-          <w:rtl w:val="1"/>
-        </w:rPr>
-        <w:t xml:space="preserve">הו</w:t>
-      </w:r>
-      <w:r>
-        <w:rPr>
-          <w:color w:val="121212"/>
-          <w:sz w:val="28"/>
-          <w:szCs w:val="28"/>
-          <w:rtl w:val="1"/>
-        </w:rPr>
-        <w:t xml:space="preserve">ָ֣</w:t>
-      </w:r>
-      <w:r>
-        <w:rPr>
-          <w:color w:val="121212"/>
-          <w:sz w:val="28"/>
-          <w:szCs w:val="28"/>
-          <w:rtl w:val="1"/>
-        </w:rPr>
-        <w:t xml:space="preserve">ה</w:t>
+        <w:t xml:space="preserve">יהוה</w:t>
       </w:r>
       <w:r>
         <w:rPr>
@@ -14291,43 +14029,7 @@
           <w:szCs w:val="28"/>
           <w:rtl w:val="1"/>
         </w:rPr>
-        <w:t xml:space="preserve">י</w:t>
-      </w:r>
-      <w:r>
-        <w:rPr>
-          <w:color w:val="121212"/>
-          <w:sz w:val="28"/>
-          <w:szCs w:val="28"/>
-          <w:rtl w:val="1"/>
-        </w:rPr>
-        <w:t xml:space="preserve">ְ</w:t>
-      </w:r>
-      <w:r>
-        <w:rPr>
-          <w:color w:val="121212"/>
-          <w:sz w:val="28"/>
-          <w:szCs w:val="28"/>
-          <w:rtl w:val="1"/>
-        </w:rPr>
-        <w:t xml:space="preserve">הו</w:t>
-      </w:r>
-      <w:r>
-        <w:rPr>
-          <w:color w:val="121212"/>
-          <w:sz w:val="28"/>
-          <w:szCs w:val="28"/>
-          <w:rtl w:val="1"/>
-        </w:rPr>
-        <w:t xml:space="preserve">ָ֣</w:t>
-      </w:r>
-      <w:r>
-        <w:rPr>
-          <w:color w:val="121212"/>
-          <w:sz w:val="28"/>
-          <w:szCs w:val="28"/>
-          <w:rtl w:val="1"/>
-        </w:rPr>
-        <w:t xml:space="preserve">ה</w:t>
+        <w:t xml:space="preserve">יהוה</w:t>
       </w:r>
       <w:r>
         <w:rPr>
@@ -15060,43 +14762,7 @@
           <w:szCs w:val="28"/>
           <w:rtl w:val="1"/>
         </w:rPr>
-        <w:t xml:space="preserve">י</w:t>
-      </w:r>
-      <w:r>
-        <w:rPr>
-          <w:color w:val="121212"/>
-          <w:sz w:val="28"/>
-          <w:szCs w:val="28"/>
-          <w:rtl w:val="1"/>
-        </w:rPr>
-        <w:t xml:space="preserve">ְ</w:t>
-      </w:r>
-      <w:r>
-        <w:rPr>
-          <w:color w:val="121212"/>
-          <w:sz w:val="28"/>
-          <w:szCs w:val="28"/>
-          <w:rtl w:val="1"/>
-        </w:rPr>
-        <w:t xml:space="preserve">הו</w:t>
-      </w:r>
-      <w:r>
-        <w:rPr>
-          <w:color w:val="121212"/>
-          <w:sz w:val="28"/>
-          <w:szCs w:val="28"/>
-          <w:rtl w:val="1"/>
-        </w:rPr>
-        <w:t xml:space="preserve">ָ֨</w:t>
-      </w:r>
-      <w:r>
-        <w:rPr>
-          <w:color w:val="121212"/>
-          <w:sz w:val="28"/>
-          <w:szCs w:val="28"/>
-          <w:rtl w:val="1"/>
-        </w:rPr>
-        <w:t xml:space="preserve">ה</w:t>
+        <w:t xml:space="preserve">יהוה</w:t>
       </w:r>
       <w:r>
         <w:rPr>
@@ -17928,43 +17594,7 @@
           <w:szCs w:val="28"/>
           <w:rtl w:val="1"/>
         </w:rPr>
-        <w:t xml:space="preserve">י</w:t>
-      </w:r>
-      <w:r>
-        <w:rPr>
-          <w:color w:val="121212"/>
-          <w:sz w:val="28"/>
-          <w:szCs w:val="28"/>
-          <w:rtl w:val="1"/>
-        </w:rPr>
-        <w:t xml:space="preserve">ְ</w:t>
-      </w:r>
-      <w:r>
-        <w:rPr>
-          <w:color w:val="121212"/>
-          <w:sz w:val="28"/>
-          <w:szCs w:val="28"/>
-          <w:rtl w:val="1"/>
-        </w:rPr>
-        <w:t xml:space="preserve">הו</w:t>
-      </w:r>
-      <w:r>
-        <w:rPr>
-          <w:color w:val="121212"/>
-          <w:sz w:val="28"/>
-          <w:szCs w:val="28"/>
-          <w:rtl w:val="1"/>
-        </w:rPr>
-        <w:t xml:space="preserve">ָ֨</w:t>
-      </w:r>
-      <w:r>
-        <w:rPr>
-          <w:color w:val="121212"/>
-          <w:sz w:val="28"/>
-          <w:szCs w:val="28"/>
-          <w:rtl w:val="1"/>
-        </w:rPr>
-        <w:t xml:space="preserve">ה</w:t>
+        <w:t xml:space="preserve">יהוה</w:t>
       </w:r>
       <w:r>
         <w:rPr>
@@ -18877,43 +18507,7 @@
           <w:szCs w:val="28"/>
           <w:rtl w:val="1"/>
         </w:rPr>
-        <w:t xml:space="preserve">י</w:t>
-      </w:r>
-      <w:r>
-        <w:rPr>
-          <w:color w:val="121212"/>
-          <w:sz w:val="28"/>
-          <w:szCs w:val="28"/>
-          <w:rtl w:val="1"/>
-        </w:rPr>
-        <w:t xml:space="preserve">ְ</w:t>
-      </w:r>
-      <w:r>
-        <w:rPr>
-          <w:color w:val="121212"/>
-          <w:sz w:val="28"/>
-          <w:szCs w:val="28"/>
-          <w:rtl w:val="1"/>
-        </w:rPr>
-        <w:t xml:space="preserve">הו</w:t>
-      </w:r>
-      <w:r>
-        <w:rPr>
-          <w:color w:val="121212"/>
-          <w:sz w:val="28"/>
-          <w:szCs w:val="28"/>
-          <w:rtl w:val="1"/>
-        </w:rPr>
-        <w:t xml:space="preserve">ָ֨</w:t>
-      </w:r>
-      <w:r>
-        <w:rPr>
-          <w:color w:val="121212"/>
-          <w:sz w:val="28"/>
-          <w:szCs w:val="28"/>
-          <w:rtl w:val="1"/>
-        </w:rPr>
-        <w:t xml:space="preserve">ה</w:t>
+        <w:t xml:space="preserve">יהוה</w:t>
       </w:r>
       <w:r>
         <w:rPr>

</xml_diff>